<commit_message>
Update report with successful CI deployment
Co-authored-by: Copilot <223556219+Copilot@users.noreply.github.com>
</commit_message>
<xml_diff>
--- a/reports/Assignment_01_MLOps_Report.docx
+++ b/reports/Assignment_01_MLOps_Report.docx
@@ -69,7 +69,7 @@
         <w:jc w:val="center"/>
       </w:pPr>
       <w:r>
-        <w:t>Academic integrity note: this report describes this repository's own implementation and observed results. It does not claim a cloud or Kubernetes deployment that has not been verified.</w:t>
+        <w:t>Academic integrity note: this report describes this repository's own implementation and observed results. CI deployment was verified in a temporary Kind cluster; no persistent cloud or Kubernetes deployment is claimed.</w:t>
       </w:r>
     </w:p>
     <w:p>
@@ -171,7 +171,7 @@
     </w:p>
     <w:p>
       <w:r>
-        <w:t>Evidence boundary: local unit tests, strict lint, YAML parsing, and disposable-copy training/MLflow verification passed. The local Docker Desktop and Kubernetes contexts are unavailable. GitHub Actions run 10 passed the Docker build and runtime smoke test (/health and /predict). Run 11 adds an ephemeral Kind Kubernetes deployment check; verify its final result before claiming Kubernetes rollout proof.</w:t>
+        <w:t>Evidence: local unit tests and strict lint passed. GitHub Actions run 13 passed dependency installation, linting, data preparation, EDA, training, all tests, Docker image build and smoke test, plus rollout and health/prediction verification in an ephemeral Kind Kubernetes cluster. A persistent cloud or local-cluster deployment has not been performed.</w:t>
       </w:r>
     </w:p>
     <w:p>
@@ -1097,7 +1097,7 @@
     </w:p>
     <w:p>
       <w:r>
-        <w:t>GitHub Actions run 10 (commit cae31fb) completed successfully, including image build and container health/prediction checks: https://github.com/naresh-infra/mlops-heart-disease-assignment/actions/runs/38849703595. Commit 1b43647 adds ephemeral Kind rollout and Kubernetes service endpoint validation; run 11 was in progress when this report was updated: https://github.com/naresh-infra/mlops-heart-disease-assignment/actions/runs/38849945691.</w:t>
+        <w:t>GitHub Actions run 13 completed successfully for commit 7459aab. It passed lint, data preparation, EDA, model training, pytest, Docker build and container health/prediction checks, and deployment/API verification in an ephemeral Kind cluster: https://github.com/naresh-infra/2025ae05860-mlops-heart-disease-assignment/actions/runs/38850696415. This verifies the automated CI deployment, not a persistent cloud service.</w:t>
       </w:r>
     </w:p>
     <w:p>
@@ -1156,7 +1156,7 @@
     </w:p>
     <w:p>
       <w:r>
-        <w:t>At report preparation, Docker Desktop was not responding. The docker-desktop Kubernetes API was unreachable, and the minikube profile reported a nonexistent host; no local kubectl context could return a live node. GitHub Actions run 10 nevertheless verified the isolated Docker image at /health and /predict. Commit 1b43647 adds deployment to an ephemeral Kind cluster and checks rollout, service health, and prediction; run 11 was still running when this report was updated. This is automated ephemeral-cluster evidence, not a persistent cloud deployment.</w:t>
+        <w:t>The local Docker Desktop and Kubernetes contexts were unavailable during development. GitHub Actions run 13 subsequently built and ran the image, then deployed the manifests to an ephemeral Kind cluster. The workflow confirmed deployment rollout and exercised the service health and prediction endpoints. This is verified temporary-cluster deployment evidence; it is not a persistent cloud deployment.</w:t>
       </w:r>
     </w:p>
     <w:p>
@@ -1330,7 +1330,7 @@
     </w:p>
     <w:p>
       <w:r>
-        <w:t>The repository demonstrates the core end-to-end MLOps path: data cleaning and EDA, reusable preprocessing, tuned model candidates, stratified CV plus held-out evaluation, MLflow evidence, a validated inference API, telemetry, tests, Docker packaging, CI, and Kubernetes deployment configuration. Docker build/runtime proof passed in GitHub Actions run 10. The new ephemeral Kind rollout check in run 11 was pending at report update time. A persistent cloud/cluster deployment, genuine persistent-deployment screenshots, and an actual screen recording remain pending.</w:t>
+        <w:t>The repository demonstrates the core end-to-end MLOps path: data cleaning and EDA, reusable preprocessing, tuned model candidates, stratified CV plus held-out evaluation, MLflow evidence, a validated inference API, telemetry, tests, Docker packaging, CI, and Kubernetes deployment configuration. GitHub Actions run 13 passed Docker build/runtime checks and Kubernetes rollout and API verification in an ephemeral Kind cluster. A persistent cloud/cluster deployment and its screenshots remain outside the verified evidence. The pipeline screen recording is included in the repository.</w:t>
       </w:r>
     </w:p>
     <w:p>
@@ -1367,7 +1367,7 @@
     </w:p>
     <w:p>
       <w:r>
-        <w:t>Assignment deliverables still to verify after cluster access: green CI run including container runtime smoke, Kubernetes rollout and endpoint check, deployment screenshots, and a real screen recording of the end-to-end run. The accompanying MP4 is a slide-based overview, not a screen capture.</w:t>
+        <w:t>Assignment deliverables verified in this repository include the green CI run with container runtime smoke tests, ephemeral Kubernetes rollout and endpoint checks, and the real pipeline screen recording. The accompanying project_overview.mp4 is a separate slide-based overview. A persistent cloud/cluster deployment and its screenshots are not included; CI evidence is from a temporary Kind cluster.</w:t>
       </w:r>
     </w:p>
     <w:sectPr>

</xml_diff>